<commit_message>
Align attendance matrix scope, edit windows, and session status saves.
Sync attendance scope capabilities doc (markdown and Word) and enforce owner/dept/org note and excuse-reference rules in policy, controllers, and matrix UI. Apply completed-session attendance edit locks on the matrix like Manage Session, improve Late/Leave Early modal behavior, and fix session status Active saves when the switch is off.

Co-authored-by: Cursor <cursoragent@cursor.com>
</commit_message>
<xml_diff>
--- a/docs/design_docs/attendance-operation-scope-capabilities-2026-09-06.docx
+++ b/docs/design_docs/attendance-operation-scope-capabilities-2026-09-06.docx
@@ -11,7 +11,6 @@
       </w:r>
     </w:p>
     <w:p>
-      <w:pPr/>
       <w:r>
         <w:t>Access Profile reference | 6 September 2026</w:t>
       </w:r>
@@ -25,7 +24,6 @@
       </w:r>
     </w:p>
     <w:p>
-      <w:pPr/>
       <w:r>
         <w:t>Consult this document when:</w:t>
       </w:r>
@@ -55,7 +53,6 @@
       </w:r>
     </w:p>
     <w:p>
-      <w:pPr/>
       <w:r>
         <w:rPr>
           <w:b/>
@@ -64,7 +61,6 @@
       </w:r>
     </w:p>
     <w:p>
-      <w:pPr/>
       <w:r>
         <w:t xml:space="preserve">1. This doc defines </w:t>
       </w:r>
@@ -142,7 +138,6 @@
       </w:r>
     </w:p>
     <w:p>
-      <w:pPr/>
       <w:r>
         <w:rPr>
           <w:b/>
@@ -167,7 +162,6 @@
       </w:r>
     </w:p>
     <w:p>
-      <w:pPr/>
       <w:r>
         <w:rPr>
           <w:b/>
@@ -188,7 +182,6 @@
       </w:r>
     </w:p>
     <w:p>
-      <w:pPr/>
       <w:r>
         <w:t xml:space="preserve">This document defines </w:t>
       </w:r>
@@ -203,7 +196,6 @@
       </w:r>
     </w:p>
     <w:p>
-      <w:pPr/>
       <w:r>
         <w:t xml:space="preserve">Attendance data lives on </w:t>
       </w:r>
@@ -236,7 +228,6 @@
       </w:r>
     </w:p>
     <w:p>
-      <w:pPr/>
       <w:r>
         <w:t>When reading this matrix, assume the user is already viewing an attendance context they are allowed to open under those other sections.</w:t>
       </w:r>
@@ -246,14 +237,15 @@
         <w:pStyle w:val="Heading3"/>
       </w:pPr>
       <w:r>
+        <w:lastRenderedPageBreak/>
         <w:t>What this document answers</w:t>
       </w:r>
     </w:p>
     <w:tbl>
       <w:tblPr>
         <w:tblStyle w:val="TableGrid"/>
-        <w:tblW w:type="auto" w:w="0"/>
-        <w:tblLook w:firstColumn="1" w:firstRow="1" w:lastColumn="0" w:lastRow="0" w:noHBand="0" w:noVBand="1" w:val="04A0"/>
+        <w:tblW w:w="0" w:type="auto"/>
+        <w:tblLook w:val="04A0" w:firstRow="1" w:lastRow="0" w:firstColumn="1" w:lastColumn="0" w:noHBand="0" w:noVBand="1"/>
       </w:tblPr>
       <w:tblGrid>
         <w:gridCol w:w="3120"/>
@@ -263,7 +255,7 @@
       <w:tr>
         <w:tc>
           <w:tcPr>
-            <w:tcW w:type="dxa" w:w="3120"/>
+            <w:tcW w:w="3120" w:type="dxa"/>
           </w:tcPr>
           <w:p>
             <w:r>
@@ -276,7 +268,7 @@
         </w:tc>
         <w:tc>
           <w:tcPr>
-            <w:tcW w:type="dxa" w:w="3120"/>
+            <w:tcW w:w="3120" w:type="dxa"/>
           </w:tcPr>
           <w:p>
             <w:r>
@@ -289,7 +281,7 @@
         </w:tc>
         <w:tc>
           <w:tcPr>
-            <w:tcW w:type="dxa" w:w="3120"/>
+            <w:tcW w:w="3120" w:type="dxa"/>
           </w:tcPr>
           <w:p>
             <w:r>
@@ -304,7 +296,7 @@
       <w:tr>
         <w:tc>
           <w:tcPr>
-            <w:tcW w:type="dxa" w:w="3120"/>
+            <w:tcW w:w="3120" w:type="dxa"/>
           </w:tcPr>
           <w:p>
             <w:r>
@@ -314,7 +306,7 @@
         </w:tc>
         <w:tc>
           <w:tcPr>
-            <w:tcW w:type="dxa" w:w="3120"/>
+            <w:tcW w:w="3120" w:type="dxa"/>
           </w:tcPr>
           <w:p>
             <w:r>
@@ -324,7 +316,7 @@
         </w:tc>
         <w:tc>
           <w:tcPr>
-            <w:tcW w:type="dxa" w:w="3120"/>
+            <w:tcW w:w="3120" w:type="dxa"/>
           </w:tcPr>
           <w:p>
             <w:r>
@@ -336,7 +328,7 @@
       <w:tr>
         <w:tc>
           <w:tcPr>
-            <w:tcW w:type="dxa" w:w="3120"/>
+            <w:tcW w:w="3120" w:type="dxa"/>
           </w:tcPr>
           <w:p>
             <w:r>
@@ -346,7 +338,7 @@
         </w:tc>
         <w:tc>
           <w:tcPr>
-            <w:tcW w:type="dxa" w:w="3120"/>
+            <w:tcW w:w="3120" w:type="dxa"/>
           </w:tcPr>
           <w:p>
             <w:r>
@@ -356,7 +348,7 @@
         </w:tc>
         <w:tc>
           <w:tcPr>
-            <w:tcW w:type="dxa" w:w="3120"/>
+            <w:tcW w:w="3120" w:type="dxa"/>
           </w:tcPr>
           <w:p>
             <w:r>
@@ -368,7 +360,7 @@
       <w:tr>
         <w:tc>
           <w:tcPr>
-            <w:tcW w:type="dxa" w:w="3120"/>
+            <w:tcW w:w="3120" w:type="dxa"/>
           </w:tcPr>
           <w:p>
             <w:r>
@@ -378,7 +370,7 @@
         </w:tc>
         <w:tc>
           <w:tcPr>
-            <w:tcW w:type="dxa" w:w="3120"/>
+            <w:tcW w:w="3120" w:type="dxa"/>
           </w:tcPr>
           <w:p>
             <w:r>
@@ -388,7 +380,7 @@
         </w:tc>
         <w:tc>
           <w:tcPr>
-            <w:tcW w:type="dxa" w:w="3120"/>
+            <w:tcW w:w="3120" w:type="dxa"/>
           </w:tcPr>
           <w:p>
             <w:r>
@@ -400,7 +392,7 @@
       <w:tr>
         <w:tc>
           <w:tcPr>
-            <w:tcW w:type="dxa" w:w="3120"/>
+            <w:tcW w:w="3120" w:type="dxa"/>
           </w:tcPr>
           <w:p>
             <w:r>
@@ -410,7 +402,7 @@
         </w:tc>
         <w:tc>
           <w:tcPr>
-            <w:tcW w:type="dxa" w:w="3120"/>
+            <w:tcW w:w="3120" w:type="dxa"/>
           </w:tcPr>
           <w:p>
             <w:r>
@@ -420,7 +412,7 @@
         </w:tc>
         <w:tc>
           <w:tcPr>
-            <w:tcW w:type="dxa" w:w="3120"/>
+            <w:tcW w:w="3120" w:type="dxa"/>
           </w:tcPr>
           <w:p>
             <w:r>
@@ -432,7 +424,7 @@
       <w:tr>
         <w:tc>
           <w:tcPr>
-            <w:tcW w:type="dxa" w:w="3120"/>
+            <w:tcW w:w="3120" w:type="dxa"/>
           </w:tcPr>
           <w:p>
             <w:r>
@@ -442,7 +434,7 @@
         </w:tc>
         <w:tc>
           <w:tcPr>
-            <w:tcW w:type="dxa" w:w="3120"/>
+            <w:tcW w:w="3120" w:type="dxa"/>
           </w:tcPr>
           <w:p>
             <w:r>
@@ -452,7 +444,7 @@
         </w:tc>
         <w:tc>
           <w:tcPr>
-            <w:tcW w:type="dxa" w:w="3120"/>
+            <w:tcW w:w="3120" w:type="dxa"/>
           </w:tcPr>
           <w:p>
             <w:r>
@@ -472,13 +464,11 @@
       </w:r>
     </w:p>
     <w:p>
-      <w:pPr/>
       <w:r>
         <w:t>Each row answers: *Given an attendance context the user can already open, what attendance information and actions are permitted?*</w:t>
       </w:r>
     </w:p>
     <w:p>
-      <w:pPr/>
       <w:r>
         <w:t xml:space="preserve">It does </w:t>
       </w:r>
@@ -493,7 +483,6 @@
       </w:r>
     </w:p>
     <w:p>
-      <w:pPr/>
       <w:r>
         <w:rPr>
           <w:b/>
@@ -514,7 +503,6 @@
       </w:r>
     </w:p>
     <w:p>
-      <w:pPr/>
       <w:r>
         <w:rPr>
           <w:b/>
@@ -537,8 +525,8 @@
     <w:tbl>
       <w:tblPr>
         <w:tblStyle w:val="TableGrid"/>
-        <w:tblW w:type="auto" w:w="0"/>
-        <w:tblLook w:firstColumn="1" w:firstRow="1" w:lastColumn="0" w:lastRow="0" w:noHBand="0" w:noVBand="1" w:val="04A0"/>
+        <w:tblW w:w="0" w:type="auto"/>
+        <w:tblLook w:val="04A0" w:firstRow="1" w:lastRow="0" w:firstColumn="1" w:lastColumn="0" w:noHBand="0" w:noVBand="1"/>
       </w:tblPr>
       <w:tblGrid>
         <w:gridCol w:w="4680"/>
@@ -547,7 +535,7 @@
       <w:tr>
         <w:tc>
           <w:tcPr>
-            <w:tcW w:type="dxa" w:w="4680"/>
+            <w:tcW w:w="4680" w:type="dxa"/>
           </w:tcPr>
           <w:p>
             <w:r>
@@ -560,7 +548,7 @@
         </w:tc>
         <w:tc>
           <w:tcPr>
-            <w:tcW w:type="dxa" w:w="4680"/>
+            <w:tcW w:w="4680" w:type="dxa"/>
           </w:tcPr>
           <w:p>
             <w:r>
@@ -575,7 +563,7 @@
       <w:tr>
         <w:tc>
           <w:tcPr>
-            <w:tcW w:type="dxa" w:w="4680"/>
+            <w:tcW w:w="4680" w:type="dxa"/>
           </w:tcPr>
           <w:p>
             <w:r>
@@ -585,7 +573,7 @@
         </w:tc>
         <w:tc>
           <w:tcPr>
-            <w:tcW w:type="dxa" w:w="4680"/>
+            <w:tcW w:w="4680" w:type="dxa"/>
           </w:tcPr>
           <w:p>
             <w:r>
@@ -597,17 +585,18 @@
       <w:tr>
         <w:tc>
           <w:tcPr>
-            <w:tcW w:type="dxa" w:w="4680"/>
-          </w:tcPr>
-          <w:p>
-            <w:r>
+            <w:tcW w:w="4680" w:type="dxa"/>
+          </w:tcPr>
+          <w:p>
+            <w:r>
+              <w:lastRenderedPageBreak/>
               <w:t>**Manage Session — attendance panel**</w:t>
             </w:r>
           </w:p>
         </w:tc>
         <w:tc>
           <w:tcPr>
-            <w:tcW w:type="dxa" w:w="4680"/>
+            <w:tcW w:w="4680" w:type="dxa"/>
           </w:tcPr>
           <w:p>
             <w:r>
@@ -628,7 +617,6 @@
       </w:r>
     </w:p>
     <w:p>
-      <w:pPr/>
       <w:r>
         <w:t>See [admin-access-types-reference-2026-09-05.md](admin-access-types-reference-2026-09-05.md) for bypass admin types (Family A).</w:t>
       </w:r>
@@ -636,8 +624,8 @@
     <w:tbl>
       <w:tblPr>
         <w:tblStyle w:val="TableGrid"/>
-        <w:tblW w:type="auto" w:w="0"/>
-        <w:tblLook w:firstColumn="1" w:firstRow="1" w:lastColumn="0" w:lastRow="0" w:noHBand="0" w:noVBand="1" w:val="04A0"/>
+        <w:tblW w:w="0" w:type="auto"/>
+        <w:tblLook w:val="04A0" w:firstRow="1" w:lastRow="0" w:firstColumn="1" w:lastColumn="0" w:noHBand="0" w:noVBand="1"/>
       </w:tblPr>
       <w:tblGrid>
         <w:gridCol w:w="4680"/>
@@ -646,7 +634,7 @@
       <w:tr>
         <w:tc>
           <w:tcPr>
-            <w:tcW w:type="dxa" w:w="4680"/>
+            <w:tcW w:w="4680" w:type="dxa"/>
           </w:tcPr>
           <w:p>
             <w:r>
@@ -659,7 +647,7 @@
         </w:tc>
         <w:tc>
           <w:tcPr>
-            <w:tcW w:type="dxa" w:w="4680"/>
+            <w:tcW w:w="4680" w:type="dxa"/>
           </w:tcPr>
           <w:p>
             <w:r>
@@ -674,7 +662,7 @@
       <w:tr>
         <w:tc>
           <w:tcPr>
-            <w:tcW w:type="dxa" w:w="4680"/>
+            <w:tcW w:w="4680" w:type="dxa"/>
           </w:tcPr>
           <w:p>
             <w:r>
@@ -684,7 +672,7 @@
         </w:tc>
         <w:tc>
           <w:tcPr>
-            <w:tcW w:type="dxa" w:w="4680"/>
+            <w:tcW w:w="4680" w:type="dxa"/>
           </w:tcPr>
           <w:p>
             <w:r>
@@ -696,7 +684,7 @@
       <w:tr>
         <w:tc>
           <w:tcPr>
-            <w:tcW w:type="dxa" w:w="4680"/>
+            <w:tcW w:w="4680" w:type="dxa"/>
           </w:tcPr>
           <w:p>
             <w:r>
@@ -706,7 +694,7 @@
         </w:tc>
         <w:tc>
           <w:tcPr>
-            <w:tcW w:type="dxa" w:w="4680"/>
+            <w:tcW w:w="4680" w:type="dxa"/>
           </w:tcPr>
           <w:p>
             <w:r>
@@ -737,8 +725,8 @@
     <w:tbl>
       <w:tblPr>
         <w:tblStyle w:val="TableGrid"/>
-        <w:tblW w:type="auto" w:w="0"/>
-        <w:tblLook w:firstColumn="1" w:firstRow="1" w:lastColumn="0" w:lastRow="0" w:noHBand="0" w:noVBand="1" w:val="04A0"/>
+        <w:tblW w:w="0" w:type="auto"/>
+        <w:tblLook w:val="04A0" w:firstRow="1" w:lastRow="0" w:firstColumn="1" w:lastColumn="0" w:noHBand="0" w:noVBand="1"/>
       </w:tblPr>
       <w:tblGrid>
         <w:gridCol w:w="3120"/>
@@ -748,7 +736,7 @@
       <w:tr>
         <w:tc>
           <w:tcPr>
-            <w:tcW w:type="dxa" w:w="3120"/>
+            <w:tcW w:w="3120" w:type="dxa"/>
           </w:tcPr>
           <w:p>
             <w:r>
@@ -761,7 +749,7 @@
         </w:tc>
         <w:tc>
           <w:tcPr>
-            <w:tcW w:type="dxa" w:w="3120"/>
+            <w:tcW w:w="3120" w:type="dxa"/>
           </w:tcPr>
           <w:p>
             <w:r>
@@ -774,7 +762,7 @@
         </w:tc>
         <w:tc>
           <w:tcPr>
-            <w:tcW w:type="dxa" w:w="3120"/>
+            <w:tcW w:w="3120" w:type="dxa"/>
           </w:tcPr>
           <w:p>
             <w:r>
@@ -789,7 +777,7 @@
       <w:tr>
         <w:tc>
           <w:tcPr>
-            <w:tcW w:type="dxa" w:w="3120"/>
+            <w:tcW w:w="3120" w:type="dxa"/>
           </w:tcPr>
           <w:p>
             <w:r>
@@ -799,7 +787,7 @@
         </w:tc>
         <w:tc>
           <w:tcPr>
-            <w:tcW w:type="dxa" w:w="3120"/>
+            <w:tcW w:w="3120" w:type="dxa"/>
           </w:tcPr>
           <w:p>
             <w:r>
@@ -809,7 +797,7 @@
         </w:tc>
         <w:tc>
           <w:tcPr>
-            <w:tcW w:type="dxa" w:w="3120"/>
+            <w:tcW w:w="3120" w:type="dxa"/>
           </w:tcPr>
           <w:p>
             <w:r>
@@ -821,7 +809,7 @@
       <w:tr>
         <w:tc>
           <w:tcPr>
-            <w:tcW w:type="dxa" w:w="3120"/>
+            <w:tcW w:w="3120" w:type="dxa"/>
           </w:tcPr>
           <w:p>
             <w:r>
@@ -831,7 +819,7 @@
         </w:tc>
         <w:tc>
           <w:tcPr>
-            <w:tcW w:type="dxa" w:w="3120"/>
+            <w:tcW w:w="3120" w:type="dxa"/>
           </w:tcPr>
           <w:p>
             <w:r>
@@ -841,7 +829,7 @@
         </w:tc>
         <w:tc>
           <w:tcPr>
-            <w:tcW w:type="dxa" w:w="3120"/>
+            <w:tcW w:w="3120" w:type="dxa"/>
           </w:tcPr>
           <w:p>
             <w:r>
@@ -853,7 +841,7 @@
       <w:tr>
         <w:tc>
           <w:tcPr>
-            <w:tcW w:type="dxa" w:w="3120"/>
+            <w:tcW w:w="3120" w:type="dxa"/>
           </w:tcPr>
           <w:p>
             <w:r>
@@ -863,7 +851,7 @@
         </w:tc>
         <w:tc>
           <w:tcPr>
-            <w:tcW w:type="dxa" w:w="3120"/>
+            <w:tcW w:w="3120" w:type="dxa"/>
           </w:tcPr>
           <w:p>
             <w:r>
@@ -873,7 +861,7 @@
         </w:tc>
         <w:tc>
           <w:tcPr>
-            <w:tcW w:type="dxa" w:w="3120"/>
+            <w:tcW w:w="3120" w:type="dxa"/>
           </w:tcPr>
           <w:p>
             <w:r>
@@ -885,7 +873,7 @@
       <w:tr>
         <w:tc>
           <w:tcPr>
-            <w:tcW w:type="dxa" w:w="3120"/>
+            <w:tcW w:w="3120" w:type="dxa"/>
           </w:tcPr>
           <w:p>
             <w:r>
@@ -895,7 +883,7 @@
         </w:tc>
         <w:tc>
           <w:tcPr>
-            <w:tcW w:type="dxa" w:w="3120"/>
+            <w:tcW w:w="3120" w:type="dxa"/>
           </w:tcPr>
           <w:p>
             <w:r>
@@ -905,7 +893,7 @@
         </w:tc>
         <w:tc>
           <w:tcPr>
-            <w:tcW w:type="dxa" w:w="3120"/>
+            <w:tcW w:w="3120" w:type="dxa"/>
           </w:tcPr>
           <w:p>
             <w:r>
@@ -917,7 +905,6 @@
     </w:tbl>
     <w:p/>
     <w:p>
-      <w:pPr/>
       <w:r>
         <w:rPr>
           <w:b/>
@@ -933,14 +920,15 @@
         <w:pStyle w:val="Heading3"/>
       </w:pPr>
       <w:r>
+        <w:lastRenderedPageBreak/>
         <w:t>READ_ALL</w:t>
       </w:r>
     </w:p>
     <w:tbl>
       <w:tblPr>
         <w:tblStyle w:val="TableGrid"/>
-        <w:tblW w:type="auto" w:w="0"/>
-        <w:tblLook w:firstColumn="1" w:firstRow="1" w:lastColumn="0" w:lastRow="0" w:noHBand="0" w:noVBand="1" w:val="04A0"/>
+        <w:tblW w:w="0" w:type="auto"/>
+        <w:tblLook w:val="04A0" w:firstRow="1" w:lastRow="0" w:firstColumn="1" w:lastColumn="0" w:noHBand="0" w:noVBand="1"/>
       </w:tblPr>
       <w:tblGrid>
         <w:gridCol w:w="3120"/>
@@ -950,7 +938,7 @@
       <w:tr>
         <w:tc>
           <w:tcPr>
-            <w:tcW w:type="dxa" w:w="3120"/>
+            <w:tcW w:w="3120" w:type="dxa"/>
           </w:tcPr>
           <w:p>
             <w:r>
@@ -963,7 +951,7 @@
         </w:tc>
         <w:tc>
           <w:tcPr>
-            <w:tcW w:type="dxa" w:w="3120"/>
+            <w:tcW w:w="3120" w:type="dxa"/>
           </w:tcPr>
           <w:p>
             <w:r>
@@ -976,7 +964,7 @@
         </w:tc>
         <w:tc>
           <w:tcPr>
-            <w:tcW w:type="dxa" w:w="3120"/>
+            <w:tcW w:w="3120" w:type="dxa"/>
           </w:tcPr>
           <w:p>
             <w:r>
@@ -991,7 +979,7 @@
       <w:tr>
         <w:tc>
           <w:tcPr>
-            <w:tcW w:type="dxa" w:w="3120"/>
+            <w:tcW w:w="3120" w:type="dxa"/>
           </w:tcPr>
           <w:p>
             <w:r>
@@ -1001,7 +989,7 @@
         </w:tc>
         <w:tc>
           <w:tcPr>
-            <w:tcW w:type="dxa" w:w="3120"/>
+            <w:tcW w:w="3120" w:type="dxa"/>
           </w:tcPr>
           <w:p>
             <w:r>
@@ -1011,7 +999,7 @@
         </w:tc>
         <w:tc>
           <w:tcPr>
-            <w:tcW w:type="dxa" w:w="3120"/>
+            <w:tcW w:w="3120" w:type="dxa"/>
           </w:tcPr>
           <w:p>
             <w:r>
@@ -1023,7 +1011,7 @@
       <w:tr>
         <w:tc>
           <w:tcPr>
-            <w:tcW w:type="dxa" w:w="3120"/>
+            <w:tcW w:w="3120" w:type="dxa"/>
           </w:tcPr>
           <w:p>
             <w:r>
@@ -1033,7 +1021,7 @@
         </w:tc>
         <w:tc>
           <w:tcPr>
-            <w:tcW w:type="dxa" w:w="3120"/>
+            <w:tcW w:w="3120" w:type="dxa"/>
           </w:tcPr>
           <w:p>
             <w:r>
@@ -1043,11 +1031,42 @@
         </w:tc>
         <w:tc>
           <w:tcPr>
-            <w:tcW w:type="dxa" w:w="3120"/>
-          </w:tcPr>
-          <w:p>
-            <w:r>
-              <w:t>**Matrix:** student names, statuses, late/early mins, student note. Date window: 3 months from today. **Manage Session:** same fields (view).</w:t>
+            <w:tcW w:w="3120" w:type="dxa"/>
+          </w:tcPr>
+          <w:p>
+            <w:r>
+              <w:t>**</w:t>
+            </w:r>
+            <w:proofErr w:type="gramStart"/>
+            <w:r>
+              <w:t>Matrix:*</w:t>
+            </w:r>
+            <w:proofErr w:type="gramEnd"/>
+            <w:r>
+              <w:t xml:space="preserve">* student names, statuses, late/early </w:t>
+            </w:r>
+            <w:proofErr w:type="gramStart"/>
+            <w:r>
+              <w:t>mins</w:t>
+            </w:r>
+            <w:proofErr w:type="gramEnd"/>
+            <w:r>
+              <w:t>,</w:t>
+            </w:r>
+            <w:r>
+              <w:t xml:space="preserve"> </w:t>
+            </w:r>
+            <w:r>
+              <w:t>excuse/reference note</w:t>
+            </w:r>
+            <w:r>
+              <w:t>,</w:t>
+            </w:r>
+            <w:r>
+              <w:br/>
+            </w:r>
+            <w:r>
+              <w:t>Date window: 3 months from today. **Manage Session:** same fields (view).</w:t>
             </w:r>
           </w:p>
         </w:tc>
@@ -1055,7 +1074,7 @@
       <w:tr>
         <w:tc>
           <w:tcPr>
-            <w:tcW w:type="dxa" w:w="3120"/>
+            <w:tcW w:w="3120" w:type="dxa"/>
           </w:tcPr>
           <w:p>
             <w:r>
@@ -1065,7 +1084,7 @@
         </w:tc>
         <w:tc>
           <w:tcPr>
-            <w:tcW w:type="dxa" w:w="3120"/>
+            <w:tcW w:w="3120" w:type="dxa"/>
           </w:tcPr>
           <w:p>
             <w:r>
@@ -1075,11 +1094,25 @@
         </w:tc>
         <w:tc>
           <w:tcPr>
-            <w:tcW w:type="dxa" w:w="3120"/>
-          </w:tcPr>
-          <w:p>
-            <w:r>
-              <w:t>**Matrix:** `+` excuse/reference notes, student notes, attached files, admin discussion, excuse marks, rollups. Date window: 1 year. **Manage Session:** `+` excuse notes, files, admin discussion.</w:t>
+            <w:tcW w:w="3120" w:type="dxa"/>
+          </w:tcPr>
+          <w:p>
+            <w:r>
+              <w:t>**</w:t>
+            </w:r>
+            <w:proofErr w:type="gramStart"/>
+            <w:r>
+              <w:t>Matrix:*</w:t>
+            </w:r>
+            <w:proofErr w:type="gramEnd"/>
+            <w:r>
+              <w:t xml:space="preserve">* `+` excuse/reference notes, student notes, attached files, admin discussion, excuse marks, rollups. </w:t>
+            </w:r>
+            <w:r>
+              <w:br/>
+            </w:r>
+            <w:r>
+              <w:t>Date window: 1 year. **Manage Session:** `+` excuse notes, files, admin discussion.</w:t>
             </w:r>
           </w:p>
         </w:tc>
@@ -1087,7 +1120,7 @@
       <w:tr>
         <w:tc>
           <w:tcPr>
-            <w:tcW w:type="dxa" w:w="3120"/>
+            <w:tcW w:w="3120" w:type="dxa"/>
           </w:tcPr>
           <w:p>
             <w:r>
@@ -1097,7 +1130,7 @@
         </w:tc>
         <w:tc>
           <w:tcPr>
-            <w:tcW w:type="dxa" w:w="3120"/>
+            <w:tcW w:w="3120" w:type="dxa"/>
           </w:tcPr>
           <w:p>
             <w:r>
@@ -1107,7 +1140,7 @@
         </w:tc>
         <w:tc>
           <w:tcPr>
-            <w:tcW w:type="dxa" w:w="3120"/>
+            <w:tcW w:w="3120" w:type="dxa"/>
           </w:tcPr>
           <w:p>
             <w:r>
@@ -1119,7 +1152,7 @@
       <w:tr>
         <w:tc>
           <w:tcPr>
-            <w:tcW w:type="dxa" w:w="3120"/>
+            <w:tcW w:w="3120" w:type="dxa"/>
           </w:tcPr>
           <w:p>
             <w:r>
@@ -1129,7 +1162,7 @@
         </w:tc>
         <w:tc>
           <w:tcPr>
-            <w:tcW w:type="dxa" w:w="3120"/>
+            <w:tcW w:w="3120" w:type="dxa"/>
           </w:tcPr>
           <w:p>
             <w:r>
@@ -1139,7 +1172,7 @@
         </w:tc>
         <w:tc>
           <w:tcPr>
-            <w:tcW w:type="dxa" w:w="3120"/>
+            <w:tcW w:w="3120" w:type="dxa"/>
           </w:tcPr>
           <w:p>
             <w:r>
@@ -1151,7 +1184,6 @@
     </w:tbl>
     <w:p/>
     <w:p>
-      <w:pPr/>
       <w:r>
         <w:rPr>
           <w:b/>
@@ -1217,14 +1249,15 @@
         <w:pStyle w:val="Heading3"/>
       </w:pPr>
       <w:r>
+        <w:lastRenderedPageBreak/>
         <w:t>UPDATE</w:t>
       </w:r>
     </w:p>
     <w:tbl>
       <w:tblPr>
         <w:tblStyle w:val="TableGrid"/>
-        <w:tblW w:type="auto" w:w="0"/>
-        <w:tblLook w:firstColumn="1" w:firstRow="1" w:lastColumn="0" w:lastRow="0" w:noHBand="0" w:noVBand="1" w:val="04A0"/>
+        <w:tblW w:w="0" w:type="auto"/>
+        <w:tblLook w:val="04A0" w:firstRow="1" w:lastRow="0" w:firstColumn="1" w:lastColumn="0" w:noHBand="0" w:noVBand="1"/>
       </w:tblPr>
       <w:tblGrid>
         <w:gridCol w:w="3120"/>
@@ -1234,7 +1267,7 @@
       <w:tr>
         <w:tc>
           <w:tcPr>
-            <w:tcW w:type="dxa" w:w="3120"/>
+            <w:tcW w:w="3120" w:type="dxa"/>
           </w:tcPr>
           <w:p>
             <w:r>
@@ -1247,7 +1280,7 @@
         </w:tc>
         <w:tc>
           <w:tcPr>
-            <w:tcW w:type="dxa" w:w="3120"/>
+            <w:tcW w:w="3120" w:type="dxa"/>
           </w:tcPr>
           <w:p>
             <w:r>
@@ -1260,7 +1293,7 @@
         </w:tc>
         <w:tc>
           <w:tcPr>
-            <w:tcW w:type="dxa" w:w="3120"/>
+            <w:tcW w:w="3120" w:type="dxa"/>
           </w:tcPr>
           <w:p>
             <w:r>
@@ -1275,7 +1308,7 @@
       <w:tr>
         <w:tc>
           <w:tcPr>
-            <w:tcW w:type="dxa" w:w="3120"/>
+            <w:tcW w:w="3120" w:type="dxa"/>
           </w:tcPr>
           <w:p>
             <w:r>
@@ -1285,7 +1318,7 @@
         </w:tc>
         <w:tc>
           <w:tcPr>
-            <w:tcW w:type="dxa" w:w="3120"/>
+            <w:tcW w:w="3120" w:type="dxa"/>
           </w:tcPr>
           <w:p>
             <w:r>
@@ -1295,7 +1328,7 @@
         </w:tc>
         <w:tc>
           <w:tcPr>
-            <w:tcW w:type="dxa" w:w="3120"/>
+            <w:tcW w:w="3120" w:type="dxa"/>
           </w:tcPr>
           <w:p>
             <w:r>
@@ -1307,7 +1340,7 @@
       <w:tr>
         <w:tc>
           <w:tcPr>
-            <w:tcW w:type="dxa" w:w="3120"/>
+            <w:tcW w:w="3120" w:type="dxa"/>
           </w:tcPr>
           <w:p>
             <w:r>
@@ -1317,7 +1350,7 @@
         </w:tc>
         <w:tc>
           <w:tcPr>
-            <w:tcW w:type="dxa" w:w="3120"/>
+            <w:tcW w:w="3120" w:type="dxa"/>
           </w:tcPr>
           <w:p>
             <w:r>
@@ -1327,7 +1360,7 @@
         </w:tc>
         <w:tc>
           <w:tcPr>
-            <w:tcW w:type="dxa" w:w="3120"/>
+            <w:tcW w:w="3120" w:type="dxa"/>
           </w:tcPr>
           <w:p>
             <w:r>
@@ -1339,7 +1372,7 @@
       <w:tr>
         <w:tc>
           <w:tcPr>
-            <w:tcW w:type="dxa" w:w="3120"/>
+            <w:tcW w:w="3120" w:type="dxa"/>
           </w:tcPr>
           <w:p>
             <w:r>
@@ -1349,7 +1382,7 @@
         </w:tc>
         <w:tc>
           <w:tcPr>
-            <w:tcW w:type="dxa" w:w="3120"/>
+            <w:tcW w:w="3120" w:type="dxa"/>
           </w:tcPr>
           <w:p>
             <w:r>
@@ -1359,11 +1392,19 @@
         </w:tc>
         <w:tc>
           <w:tcPr>
-            <w:tcW w:type="dxa" w:w="3120"/>
-          </w:tcPr>
-          <w:p>
-            <w:r>
-              <w:t>**Matrix:** `+` excuse notes, student note, files, admin discussion. **Manage Session:** same.</w:t>
+            <w:tcW w:w="3120" w:type="dxa"/>
+          </w:tcPr>
+          <w:p>
+            <w:r>
+              <w:t>**</w:t>
+            </w:r>
+            <w:proofErr w:type="gramStart"/>
+            <w:r>
+              <w:t>Matrix:*</w:t>
+            </w:r>
+            <w:proofErr w:type="gramEnd"/>
+            <w:r>
+              <w:t>* `+` excuse notes, files, admin discussion. **Manage Session:** same.</w:t>
             </w:r>
           </w:p>
         </w:tc>
@@ -1371,7 +1412,7 @@
       <w:tr>
         <w:tc>
           <w:tcPr>
-            <w:tcW w:type="dxa" w:w="3120"/>
+            <w:tcW w:w="3120" w:type="dxa"/>
           </w:tcPr>
           <w:p>
             <w:r>
@@ -1381,7 +1422,7 @@
         </w:tc>
         <w:tc>
           <w:tcPr>
-            <w:tcW w:type="dxa" w:w="3120"/>
+            <w:tcW w:w="3120" w:type="dxa"/>
           </w:tcPr>
           <w:p>
             <w:r>
@@ -1391,11 +1432,28 @@
         </w:tc>
         <w:tc>
           <w:tcPr>
-            <w:tcW w:type="dxa" w:w="3120"/>
-          </w:tcPr>
-          <w:p>
-            <w:r>
-              <w:t>**Matrix:** `+` excuse flags (Late/Early, Absent, ACF); edit after completed-session deadline. **Manage Session:** same.</w:t>
+            <w:tcW w:w="3120" w:type="dxa"/>
+          </w:tcPr>
+          <w:p>
+            <w:r>
+              <w:t>**</w:t>
+            </w:r>
+            <w:proofErr w:type="gramStart"/>
+            <w:r>
+              <w:t>Matrix:*</w:t>
+            </w:r>
+            <w:proofErr w:type="gramEnd"/>
+            <w:r>
+              <w:t xml:space="preserve">* `+` </w:t>
+            </w:r>
+            <w:r>
+              <w:t>student note,</w:t>
+            </w:r>
+            <w:r>
+              <w:t xml:space="preserve"> </w:t>
+            </w:r>
+            <w:r>
+              <w:t>excuse flags (Late/Early, Absent, ACF); edit after completed-session deadline. **Manage Session:** same.</w:t>
             </w:r>
           </w:p>
         </w:tc>
@@ -1403,7 +1461,7 @@
       <w:tr>
         <w:tc>
           <w:tcPr>
-            <w:tcW w:type="dxa" w:w="3120"/>
+            <w:tcW w:w="3120" w:type="dxa"/>
           </w:tcPr>
           <w:p>
             <w:r>
@@ -1413,7 +1471,7 @@
         </w:tc>
         <w:tc>
           <w:tcPr>
-            <w:tcW w:type="dxa" w:w="3120"/>
+            <w:tcW w:w="3120" w:type="dxa"/>
           </w:tcPr>
           <w:p>
             <w:r>
@@ -1423,7 +1481,7 @@
         </w:tc>
         <w:tc>
           <w:tcPr>
-            <w:tcW w:type="dxa" w:w="3120"/>
+            <w:tcW w:w="3120" w:type="dxa"/>
           </w:tcPr>
           <w:p>
             <w:r>
@@ -1435,7 +1493,6 @@
     </w:tbl>
     <w:p/>
     <w:p>
-      <w:pPr/>
       <w:r>
         <w:rPr>
           <w:b/>
@@ -1543,8 +1600,8 @@
     <w:tbl>
       <w:tblPr>
         <w:tblStyle w:val="TableGrid"/>
-        <w:tblW w:type="auto" w:w="0"/>
-        <w:tblLook w:firstColumn="1" w:firstRow="1" w:lastColumn="0" w:lastRow="0" w:noHBand="0" w:noVBand="1" w:val="04A0"/>
+        <w:tblW w:w="0" w:type="auto"/>
+        <w:tblLook w:val="04A0" w:firstRow="1" w:lastRow="0" w:firstColumn="1" w:lastColumn="0" w:noHBand="0" w:noVBand="1"/>
       </w:tblPr>
       <w:tblGrid>
         <w:gridCol w:w="3120"/>
@@ -1554,7 +1611,7 @@
       <w:tr>
         <w:tc>
           <w:tcPr>
-            <w:tcW w:type="dxa" w:w="3120"/>
+            <w:tcW w:w="3120" w:type="dxa"/>
           </w:tcPr>
           <w:p>
             <w:r>
@@ -1567,7 +1624,7 @@
         </w:tc>
         <w:tc>
           <w:tcPr>
-            <w:tcW w:type="dxa" w:w="3120"/>
+            <w:tcW w:w="3120" w:type="dxa"/>
           </w:tcPr>
           <w:p>
             <w:r>
@@ -1580,7 +1637,7 @@
         </w:tc>
         <w:tc>
           <w:tcPr>
-            <w:tcW w:type="dxa" w:w="3120"/>
+            <w:tcW w:w="3120" w:type="dxa"/>
           </w:tcPr>
           <w:p>
             <w:r>
@@ -1595,17 +1652,18 @@
       <w:tr>
         <w:tc>
           <w:tcPr>
-            <w:tcW w:type="dxa" w:w="3120"/>
-          </w:tcPr>
-          <w:p>
-            <w:r>
+            <w:tcW w:w="3120" w:type="dxa"/>
+          </w:tcPr>
+          <w:p>
+            <w:r>
+              <w:lastRenderedPageBreak/>
               <w:t>DELETE</w:t>
             </w:r>
           </w:p>
         </w:tc>
         <w:tc>
           <w:tcPr>
-            <w:tcW w:type="dxa" w:w="3120"/>
+            <w:tcW w:w="3120" w:type="dxa"/>
           </w:tcPr>
           <w:p>
             <w:r>
@@ -1615,7 +1673,7 @@
         </w:tc>
         <w:tc>
           <w:tcPr>
-            <w:tcW w:type="dxa" w:w="3120"/>
+            <w:tcW w:w="3120" w:type="dxa"/>
           </w:tcPr>
           <w:p>
             <w:r>
@@ -1627,7 +1685,7 @@
       <w:tr>
         <w:tc>
           <w:tcPr>
-            <w:tcW w:type="dxa" w:w="3120"/>
+            <w:tcW w:w="3120" w:type="dxa"/>
           </w:tcPr>
           <w:p>
             <w:r>
@@ -1637,7 +1695,7 @@
         </w:tc>
         <w:tc>
           <w:tcPr>
-            <w:tcW w:type="dxa" w:w="3120"/>
+            <w:tcW w:w="3120" w:type="dxa"/>
           </w:tcPr>
           <w:p>
             <w:r>
@@ -1647,7 +1705,7 @@
         </w:tc>
         <w:tc>
           <w:tcPr>
-            <w:tcW w:type="dxa" w:w="3120"/>
+            <w:tcW w:w="3120" w:type="dxa"/>
           </w:tcPr>
           <w:p>
             <w:r>
@@ -1669,8 +1727,8 @@
     <w:tbl>
       <w:tblPr>
         <w:tblStyle w:val="TableGrid"/>
-        <w:tblW w:type="auto" w:w="0"/>
-        <w:tblLook w:firstColumn="1" w:firstRow="1" w:lastColumn="0" w:lastRow="0" w:noHBand="0" w:noVBand="1" w:val="04A0"/>
+        <w:tblW w:w="0" w:type="auto"/>
+        <w:tblLook w:val="04A0" w:firstRow="1" w:lastRow="0" w:firstColumn="1" w:lastColumn="0" w:noHBand="0" w:noVBand="1"/>
       </w:tblPr>
       <w:tblGrid>
         <w:gridCol w:w="3120"/>
@@ -1680,7 +1738,7 @@
       <w:tr>
         <w:tc>
           <w:tcPr>
-            <w:tcW w:type="dxa" w:w="3120"/>
+            <w:tcW w:w="3120" w:type="dxa"/>
           </w:tcPr>
           <w:p>
             <w:r>
@@ -1693,7 +1751,7 @@
         </w:tc>
         <w:tc>
           <w:tcPr>
-            <w:tcW w:type="dxa" w:w="3120"/>
+            <w:tcW w:w="3120" w:type="dxa"/>
           </w:tcPr>
           <w:p>
             <w:r>
@@ -1706,7 +1764,7 @@
         </w:tc>
         <w:tc>
           <w:tcPr>
-            <w:tcW w:type="dxa" w:w="3120"/>
+            <w:tcW w:w="3120" w:type="dxa"/>
           </w:tcPr>
           <w:p>
             <w:r>
@@ -1721,7 +1779,7 @@
       <w:tr>
         <w:tc>
           <w:tcPr>
-            <w:tcW w:type="dxa" w:w="3120"/>
+            <w:tcW w:w="3120" w:type="dxa"/>
           </w:tcPr>
           <w:p>
             <w:r>
@@ -1731,7 +1789,7 @@
         </w:tc>
         <w:tc>
           <w:tcPr>
-            <w:tcW w:type="dxa" w:w="3120"/>
+            <w:tcW w:w="3120" w:type="dxa"/>
           </w:tcPr>
           <w:p>
             <w:r>
@@ -1741,7 +1799,7 @@
         </w:tc>
         <w:tc>
           <w:tcPr>
-            <w:tcW w:type="dxa" w:w="3120"/>
+            <w:tcW w:w="3120" w:type="dxa"/>
           </w:tcPr>
           <w:p>
             <w:r>
@@ -1753,7 +1811,7 @@
       <w:tr>
         <w:tc>
           <w:tcPr>
-            <w:tcW w:type="dxa" w:w="3120"/>
+            <w:tcW w:w="3120" w:type="dxa"/>
           </w:tcPr>
           <w:p>
             <w:r>
@@ -1763,7 +1821,7 @@
         </w:tc>
         <w:tc>
           <w:tcPr>
-            <w:tcW w:type="dxa" w:w="3120"/>
+            <w:tcW w:w="3120" w:type="dxa"/>
           </w:tcPr>
           <w:p>
             <w:r>
@@ -1773,7 +1831,7 @@
         </w:tc>
         <w:tc>
           <w:tcPr>
-            <w:tcW w:type="dxa" w:w="3120"/>
+            <w:tcW w:w="3120" w:type="dxa"/>
           </w:tcPr>
           <w:p>
             <w:r>
@@ -1795,8 +1853,8 @@
     <w:tbl>
       <w:tblPr>
         <w:tblStyle w:val="TableGrid"/>
-        <w:tblW w:type="auto" w:w="0"/>
-        <w:tblLook w:firstColumn="1" w:firstRow="1" w:lastColumn="0" w:lastRow="0" w:noHBand="0" w:noVBand="1" w:val="04A0"/>
+        <w:tblW w:w="0" w:type="auto"/>
+        <w:tblLook w:val="04A0" w:firstRow="1" w:lastRow="0" w:firstColumn="1" w:lastColumn="0" w:noHBand="0" w:noVBand="1"/>
       </w:tblPr>
       <w:tblGrid>
         <w:gridCol w:w="3120"/>
@@ -1806,7 +1864,7 @@
       <w:tr>
         <w:tc>
           <w:tcPr>
-            <w:tcW w:type="dxa" w:w="3120"/>
+            <w:tcW w:w="3120" w:type="dxa"/>
           </w:tcPr>
           <w:p>
             <w:r>
@@ -1819,7 +1877,7 @@
         </w:tc>
         <w:tc>
           <w:tcPr>
-            <w:tcW w:type="dxa" w:w="3120"/>
+            <w:tcW w:w="3120" w:type="dxa"/>
           </w:tcPr>
           <w:p>
             <w:r>
@@ -1832,7 +1890,7 @@
         </w:tc>
         <w:tc>
           <w:tcPr>
-            <w:tcW w:type="dxa" w:w="3120"/>
+            <w:tcW w:w="3120" w:type="dxa"/>
           </w:tcPr>
           <w:p>
             <w:r>
@@ -1847,7 +1905,7 @@
       <w:tr>
         <w:tc>
           <w:tcPr>
-            <w:tcW w:type="dxa" w:w="3120"/>
+            <w:tcW w:w="3120" w:type="dxa"/>
           </w:tcPr>
           <w:p>
             <w:r>
@@ -1857,7 +1915,7 @@
         </w:tc>
         <w:tc>
           <w:tcPr>
-            <w:tcW w:type="dxa" w:w="3120"/>
+            <w:tcW w:w="3120" w:type="dxa"/>
           </w:tcPr>
           <w:p>
             <w:r>
@@ -1867,7 +1925,7 @@
         </w:tc>
         <w:tc>
           <w:tcPr>
-            <w:tcW w:type="dxa" w:w="3120"/>
+            <w:tcW w:w="3120" w:type="dxa"/>
           </w:tcPr>
           <w:p>
             <w:r>
@@ -1879,7 +1937,7 @@
       <w:tr>
         <w:tc>
           <w:tcPr>
-            <w:tcW w:type="dxa" w:w="3120"/>
+            <w:tcW w:w="3120" w:type="dxa"/>
           </w:tcPr>
           <w:p>
             <w:r>
@@ -1889,7 +1947,7 @@
         </w:tc>
         <w:tc>
           <w:tcPr>
-            <w:tcW w:type="dxa" w:w="3120"/>
+            <w:tcW w:w="3120" w:type="dxa"/>
           </w:tcPr>
           <w:p>
             <w:r>
@@ -1899,7 +1957,7 @@
         </w:tc>
         <w:tc>
           <w:tcPr>
-            <w:tcW w:type="dxa" w:w="3120"/>
+            <w:tcW w:w="3120" w:type="dxa"/>
           </w:tcPr>
           <w:p>
             <w:r>
@@ -1911,7 +1969,7 @@
       <w:tr>
         <w:tc>
           <w:tcPr>
-            <w:tcW w:type="dxa" w:w="3120"/>
+            <w:tcW w:w="3120" w:type="dxa"/>
           </w:tcPr>
           <w:p>
             <w:r>
@@ -1921,7 +1979,7 @@
         </w:tc>
         <w:tc>
           <w:tcPr>
-            <w:tcW w:type="dxa" w:w="3120"/>
+            <w:tcW w:w="3120" w:type="dxa"/>
           </w:tcPr>
           <w:p>
             <w:r>
@@ -1931,7 +1989,7 @@
         </w:tc>
         <w:tc>
           <w:tcPr>
-            <w:tcW w:type="dxa" w:w="3120"/>
+            <w:tcW w:w="3120" w:type="dxa"/>
           </w:tcPr>
           <w:p>
             <w:r>
@@ -1953,8 +2011,8 @@
     <w:tbl>
       <w:tblPr>
         <w:tblStyle w:val="TableGrid"/>
-        <w:tblW w:type="auto" w:w="0"/>
-        <w:tblLook w:firstColumn="1" w:firstRow="1" w:lastColumn="0" w:lastRow="0" w:noHBand="0" w:noVBand="1" w:val="04A0"/>
+        <w:tblW w:w="0" w:type="auto"/>
+        <w:tblLook w:val="04A0" w:firstRow="1" w:lastRow="0" w:firstColumn="1" w:lastColumn="0" w:noHBand="0" w:noVBand="1"/>
       </w:tblPr>
       <w:tblGrid>
         <w:gridCol w:w="3120"/>
@@ -1964,7 +2022,7 @@
       <w:tr>
         <w:tc>
           <w:tcPr>
-            <w:tcW w:type="dxa" w:w="3120"/>
+            <w:tcW w:w="3120" w:type="dxa"/>
           </w:tcPr>
           <w:p>
             <w:r>
@@ -1977,7 +2035,7 @@
         </w:tc>
         <w:tc>
           <w:tcPr>
-            <w:tcW w:type="dxa" w:w="3120"/>
+            <w:tcW w:w="3120" w:type="dxa"/>
           </w:tcPr>
           <w:p>
             <w:r>
@@ -1990,7 +2048,7 @@
         </w:tc>
         <w:tc>
           <w:tcPr>
-            <w:tcW w:type="dxa" w:w="3120"/>
+            <w:tcW w:w="3120" w:type="dxa"/>
           </w:tcPr>
           <w:p>
             <w:r>
@@ -2005,7 +2063,7 @@
       <w:tr>
         <w:tc>
           <w:tcPr>
-            <w:tcW w:type="dxa" w:w="3120"/>
+            <w:tcW w:w="3120" w:type="dxa"/>
           </w:tcPr>
           <w:p>
             <w:r>
@@ -2015,7 +2073,7 @@
         </w:tc>
         <w:tc>
           <w:tcPr>
-            <w:tcW w:type="dxa" w:w="3120"/>
+            <w:tcW w:w="3120" w:type="dxa"/>
           </w:tcPr>
           <w:p>
             <w:r>
@@ -2025,7 +2083,7 @@
         </w:tc>
         <w:tc>
           <w:tcPr>
-            <w:tcW w:type="dxa" w:w="3120"/>
+            <w:tcW w:w="3120" w:type="dxa"/>
           </w:tcPr>
           <w:p>
             <w:r>
@@ -2037,7 +2095,7 @@
       <w:tr>
         <w:tc>
           <w:tcPr>
-            <w:tcW w:type="dxa" w:w="3120"/>
+            <w:tcW w:w="3120" w:type="dxa"/>
           </w:tcPr>
           <w:p>
             <w:r>
@@ -2047,7 +2105,7 @@
         </w:tc>
         <w:tc>
           <w:tcPr>
-            <w:tcW w:type="dxa" w:w="3120"/>
+            <w:tcW w:w="3120" w:type="dxa"/>
           </w:tcPr>
           <w:p>
             <w:r>
@@ -2057,7 +2115,7 @@
         </w:tc>
         <w:tc>
           <w:tcPr>
-            <w:tcW w:type="dxa" w:w="3120"/>
+            <w:tcW w:w="3120" w:type="dxa"/>
           </w:tcPr>
           <w:p>
             <w:r>
@@ -2069,7 +2127,7 @@
       <w:tr>
         <w:tc>
           <w:tcPr>
-            <w:tcW w:type="dxa" w:w="3120"/>
+            <w:tcW w:w="3120" w:type="dxa"/>
           </w:tcPr>
           <w:p>
             <w:r>
@@ -2079,7 +2137,7 @@
         </w:tc>
         <w:tc>
           <w:tcPr>
-            <w:tcW w:type="dxa" w:w="3120"/>
+            <w:tcW w:w="3120" w:type="dxa"/>
           </w:tcPr>
           <w:p>
             <w:r>
@@ -2089,7 +2147,7 @@
         </w:tc>
         <w:tc>
           <w:tcPr>
-            <w:tcW w:type="dxa" w:w="3120"/>
+            <w:tcW w:w="3120" w:type="dxa"/>
           </w:tcPr>
           <w:p>
             <w:r>
@@ -2111,8 +2169,8 @@
     <w:tbl>
       <w:tblPr>
         <w:tblStyle w:val="TableGrid"/>
-        <w:tblW w:type="auto" w:w="0"/>
-        <w:tblLook w:firstColumn="1" w:firstRow="1" w:lastColumn="0" w:lastRow="0" w:noHBand="0" w:noVBand="1" w:val="04A0"/>
+        <w:tblW w:w="0" w:type="auto"/>
+        <w:tblLook w:val="04A0" w:firstRow="1" w:lastRow="0" w:firstColumn="1" w:lastColumn="0" w:noHBand="0" w:noVBand="1"/>
       </w:tblPr>
       <w:tblGrid>
         <w:gridCol w:w="3120"/>
@@ -2122,7 +2180,7 @@
       <w:tr>
         <w:tc>
           <w:tcPr>
-            <w:tcW w:type="dxa" w:w="3120"/>
+            <w:tcW w:w="3120" w:type="dxa"/>
           </w:tcPr>
           <w:p>
             <w:r>
@@ -2135,7 +2193,7 @@
         </w:tc>
         <w:tc>
           <w:tcPr>
-            <w:tcW w:type="dxa" w:w="3120"/>
+            <w:tcW w:w="3120" w:type="dxa"/>
           </w:tcPr>
           <w:p>
             <w:r>
@@ -2148,7 +2206,7 @@
         </w:tc>
         <w:tc>
           <w:tcPr>
-            <w:tcW w:type="dxa" w:w="3120"/>
+            <w:tcW w:w="3120" w:type="dxa"/>
           </w:tcPr>
           <w:p>
             <w:r>
@@ -2163,17 +2221,18 @@
       <w:tr>
         <w:tc>
           <w:tcPr>
-            <w:tcW w:type="dxa" w:w="3120"/>
-          </w:tcPr>
-          <w:p>
-            <w:r>
+            <w:tcW w:w="3120" w:type="dxa"/>
+          </w:tcPr>
+          <w:p>
+            <w:r>
+              <w:lastRenderedPageBreak/>
               <w:t>UPLOAD</w:t>
             </w:r>
           </w:p>
         </w:tc>
         <w:tc>
           <w:tcPr>
-            <w:tcW w:type="dxa" w:w="3120"/>
+            <w:tcW w:w="3120" w:type="dxa"/>
           </w:tcPr>
           <w:p>
             <w:r>
@@ -2183,7 +2242,7 @@
         </w:tc>
         <w:tc>
           <w:tcPr>
-            <w:tcW w:type="dxa" w:w="3120"/>
+            <w:tcW w:w="3120" w:type="dxa"/>
           </w:tcPr>
           <w:p>
             <w:r>
@@ -2195,7 +2254,7 @@
       <w:tr>
         <w:tc>
           <w:tcPr>
-            <w:tcW w:type="dxa" w:w="3120"/>
+            <w:tcW w:w="3120" w:type="dxa"/>
           </w:tcPr>
           <w:p>
             <w:r>
@@ -2205,7 +2264,7 @@
         </w:tc>
         <w:tc>
           <w:tcPr>
-            <w:tcW w:type="dxa" w:w="3120"/>
+            <w:tcW w:w="3120" w:type="dxa"/>
           </w:tcPr>
           <w:p>
             <w:r>
@@ -2215,7 +2274,7 @@
         </w:tc>
         <w:tc>
           <w:tcPr>
-            <w:tcW w:type="dxa" w:w="3120"/>
+            <w:tcW w:w="3120" w:type="dxa"/>
           </w:tcPr>
           <w:p>
             <w:r>
@@ -2227,7 +2286,7 @@
       <w:tr>
         <w:tc>
           <w:tcPr>
-            <w:tcW w:type="dxa" w:w="3120"/>
+            <w:tcW w:w="3120" w:type="dxa"/>
           </w:tcPr>
           <w:p>
             <w:r>
@@ -2237,7 +2296,7 @@
         </w:tc>
         <w:tc>
           <w:tcPr>
-            <w:tcW w:type="dxa" w:w="3120"/>
+            <w:tcW w:w="3120" w:type="dxa"/>
           </w:tcPr>
           <w:p>
             <w:r>
@@ -2247,7 +2306,7 @@
         </w:tc>
         <w:tc>
           <w:tcPr>
-            <w:tcW w:type="dxa" w:w="3120"/>
+            <w:tcW w:w="3120" w:type="dxa"/>
           </w:tcPr>
           <w:p>
             <w:r>
@@ -2270,8 +2329,8 @@
     <w:tbl>
       <w:tblPr>
         <w:tblStyle w:val="TableGrid"/>
-        <w:tblW w:type="auto" w:w="0"/>
-        <w:tblLook w:firstColumn="1" w:firstRow="1" w:lastColumn="0" w:lastRow="0" w:noHBand="0" w:noVBand="1" w:val="04A0"/>
+        <w:tblW w:w="0" w:type="auto"/>
+        <w:tblLook w:val="04A0" w:firstRow="1" w:lastRow="0" w:firstColumn="1" w:lastColumn="0" w:noHBand="0" w:noVBand="1"/>
       </w:tblPr>
       <w:tblGrid>
         <w:gridCol w:w="4680"/>
@@ -2280,7 +2339,7 @@
       <w:tr>
         <w:tc>
           <w:tcPr>
-            <w:tcW w:type="dxa" w:w="4680"/>
+            <w:tcW w:w="4680" w:type="dxa"/>
           </w:tcPr>
           <w:p>
             <w:r>
@@ -2293,7 +2352,7 @@
         </w:tc>
         <w:tc>
           <w:tcPr>
-            <w:tcW w:type="dxa" w:w="4680"/>
+            <w:tcW w:w="4680" w:type="dxa"/>
           </w:tcPr>
           <w:p>
             <w:r>
@@ -2308,7 +2367,7 @@
       <w:tr>
         <w:tc>
           <w:tcPr>
-            <w:tcW w:type="dxa" w:w="4680"/>
+            <w:tcW w:w="4680" w:type="dxa"/>
           </w:tcPr>
           <w:p>
             <w:r>
@@ -2318,7 +2377,7 @@
         </w:tc>
         <w:tc>
           <w:tcPr>
-            <w:tcW w:type="dxa" w:w="4680"/>
+            <w:tcW w:w="4680" w:type="dxa"/>
           </w:tcPr>
           <w:p>
             <w:r>
@@ -2330,7 +2389,7 @@
       <w:tr>
         <w:tc>
           <w:tcPr>
-            <w:tcW w:type="dxa" w:w="4680"/>
+            <w:tcW w:w="4680" w:type="dxa"/>
           </w:tcPr>
           <w:p>
             <w:r>
@@ -2340,7 +2399,7 @@
         </w:tc>
         <w:tc>
           <w:tcPr>
-            <w:tcW w:type="dxa" w:w="4680"/>
+            <w:tcW w:w="4680" w:type="dxa"/>
           </w:tcPr>
           <w:p>
             <w:r>
@@ -2352,7 +2411,7 @@
       <w:tr>
         <w:tc>
           <w:tcPr>
-            <w:tcW w:type="dxa" w:w="4680"/>
+            <w:tcW w:w="4680" w:type="dxa"/>
           </w:tcPr>
           <w:p>
             <w:r>
@@ -2362,7 +2421,7 @@
         </w:tc>
         <w:tc>
           <w:tcPr>
-            <w:tcW w:type="dxa" w:w="4680"/>
+            <w:tcW w:w="4680" w:type="dxa"/>
           </w:tcPr>
           <w:p>
             <w:r>
@@ -2383,7 +2442,6 @@
       </w:r>
     </w:p>
     <w:p>
-      <w:pPr/>
       <w:r>
         <w:t xml:space="preserve">Apply to </w:t>
       </w:r>
@@ -2416,16 +2474,16 @@
       </w:r>
     </w:p>
     <w:p>
-      <w:pPr/>
       <w:r>
+        <w:lastRenderedPageBreak/>
         <w:t>Implementation: `schoolAdminAccessService.isAttendancesAdminViewerAsync`, `userCanOpenAttendanceMatrix`, `userCanMarkAttendanceExcused` (excuses follow ORGANIZATION UPDATE scope, not A6), `attendanceEnrollmentNaLockService` + `canOverrideSessionLock`.</w:t>
       </w:r>
     </w:p>
     <w:tbl>
       <w:tblPr>
         <w:tblStyle w:val="TableGrid"/>
-        <w:tblW w:type="auto" w:w="0"/>
-        <w:tblLook w:firstColumn="1" w:firstRow="1" w:lastColumn="0" w:lastRow="0" w:noHBand="0" w:noVBand="1" w:val="04A0"/>
+        <w:tblW w:w="0" w:type="auto"/>
+        <w:tblLook w:val="04A0" w:firstRow="1" w:lastRow="0" w:firstColumn="1" w:lastColumn="0" w:noHBand="0" w:noVBand="1"/>
       </w:tblPr>
       <w:tblGrid>
         <w:gridCol w:w="2340"/>
@@ -2436,7 +2494,7 @@
       <w:tr>
         <w:tc>
           <w:tcPr>
-            <w:tcW w:type="dxa" w:w="2340"/>
+            <w:tcW w:w="2340" w:type="dxa"/>
           </w:tcPr>
           <w:p>
             <w:r>
@@ -2449,7 +2507,7 @@
         </w:tc>
         <w:tc>
           <w:tcPr>
-            <w:tcW w:type="dxa" w:w="2340"/>
+            <w:tcW w:w="2340" w:type="dxa"/>
           </w:tcPr>
           <w:p>
             <w:r>
@@ -2462,7 +2520,7 @@
         </w:tc>
         <w:tc>
           <w:tcPr>
-            <w:tcW w:type="dxa" w:w="2340"/>
+            <w:tcW w:w="2340" w:type="dxa"/>
           </w:tcPr>
           <w:p>
             <w:r>
@@ -2475,7 +2533,7 @@
         </w:tc>
         <w:tc>
           <w:tcPr>
-            <w:tcW w:type="dxa" w:w="2340"/>
+            <w:tcW w:w="2340" w:type="dxa"/>
           </w:tcPr>
           <w:p>
             <w:r>
@@ -2490,7 +2548,7 @@
       <w:tr>
         <w:tc>
           <w:tcPr>
-            <w:tcW w:type="dxa" w:w="2340"/>
+            <w:tcW w:w="2340" w:type="dxa"/>
           </w:tcPr>
           <w:p>
             <w:r>
@@ -2500,7 +2558,7 @@
         </w:tc>
         <w:tc>
           <w:tcPr>
-            <w:tcW w:type="dxa" w:w="2340"/>
+            <w:tcW w:w="2340" w:type="dxa"/>
           </w:tcPr>
           <w:p>
             <w:r>
@@ -2510,7 +2568,7 @@
         </w:tc>
         <w:tc>
           <w:tcPr>
-            <w:tcW w:type="dxa" w:w="2340"/>
+            <w:tcW w:w="2340" w:type="dxa"/>
           </w:tcPr>
           <w:p>
             <w:r>
@@ -2520,7 +2578,7 @@
         </w:tc>
         <w:tc>
           <w:tcPr>
-            <w:tcW w:type="dxa" w:w="2340"/>
+            <w:tcW w:w="2340" w:type="dxa"/>
           </w:tcPr>
           <w:p>
             <w:r>
@@ -2532,7 +2590,7 @@
       <w:tr>
         <w:tc>
           <w:tcPr>
-            <w:tcW w:type="dxa" w:w="2340"/>
+            <w:tcW w:w="2340" w:type="dxa"/>
           </w:tcPr>
           <w:p>
             <w:r>
@@ -2542,7 +2600,7 @@
         </w:tc>
         <w:tc>
           <w:tcPr>
-            <w:tcW w:type="dxa" w:w="2340"/>
+            <w:tcW w:w="2340" w:type="dxa"/>
           </w:tcPr>
           <w:p>
             <w:r>
@@ -2552,7 +2610,7 @@
         </w:tc>
         <w:tc>
           <w:tcPr>
-            <w:tcW w:type="dxa" w:w="2340"/>
+            <w:tcW w:w="2340" w:type="dxa"/>
           </w:tcPr>
           <w:p>
             <w:r>
@@ -2562,7 +2620,7 @@
         </w:tc>
         <w:tc>
           <w:tcPr>
-            <w:tcW w:type="dxa" w:w="2340"/>
+            <w:tcW w:w="2340" w:type="dxa"/>
           </w:tcPr>
           <w:p>
             <w:r>
@@ -2574,7 +2632,7 @@
       <w:tr>
         <w:tc>
           <w:tcPr>
-            <w:tcW w:type="dxa" w:w="2340"/>
+            <w:tcW w:w="2340" w:type="dxa"/>
           </w:tcPr>
           <w:p>
             <w:r>
@@ -2584,7 +2642,7 @@
         </w:tc>
         <w:tc>
           <w:tcPr>
-            <w:tcW w:type="dxa" w:w="2340"/>
+            <w:tcW w:w="2340" w:type="dxa"/>
           </w:tcPr>
           <w:p>
             <w:r>
@@ -2594,7 +2652,7 @@
         </w:tc>
         <w:tc>
           <w:tcPr>
-            <w:tcW w:type="dxa" w:w="2340"/>
+            <w:tcW w:w="2340" w:type="dxa"/>
           </w:tcPr>
           <w:p>
             <w:r>
@@ -2604,7 +2662,7 @@
         </w:tc>
         <w:tc>
           <w:tcPr>
-            <w:tcW w:type="dxa" w:w="2340"/>
+            <w:tcW w:w="2340" w:type="dxa"/>
           </w:tcPr>
           <w:p>
             <w:r>
@@ -2616,7 +2674,7 @@
       <w:tr>
         <w:tc>
           <w:tcPr>
-            <w:tcW w:type="dxa" w:w="2340"/>
+            <w:tcW w:w="2340" w:type="dxa"/>
           </w:tcPr>
           <w:p>
             <w:r>
@@ -2626,7 +2684,7 @@
         </w:tc>
         <w:tc>
           <w:tcPr>
-            <w:tcW w:type="dxa" w:w="2340"/>
+            <w:tcW w:w="2340" w:type="dxa"/>
           </w:tcPr>
           <w:p>
             <w:r>
@@ -2636,7 +2694,7 @@
         </w:tc>
         <w:tc>
           <w:tcPr>
-            <w:tcW w:type="dxa" w:w="2340"/>
+            <w:tcW w:w="2340" w:type="dxa"/>
           </w:tcPr>
           <w:p>
             <w:r>
@@ -2646,7 +2704,7 @@
         </w:tc>
         <w:tc>
           <w:tcPr>
-            <w:tcW w:type="dxa" w:w="2340"/>
+            <w:tcW w:w="2340" w:type="dxa"/>
           </w:tcPr>
           <w:p>
             <w:r>
@@ -2658,7 +2716,7 @@
       <w:tr>
         <w:tc>
           <w:tcPr>
-            <w:tcW w:type="dxa" w:w="2340"/>
+            <w:tcW w:w="2340" w:type="dxa"/>
           </w:tcPr>
           <w:p>
             <w:r>
@@ -2668,7 +2726,7 @@
         </w:tc>
         <w:tc>
           <w:tcPr>
-            <w:tcW w:type="dxa" w:w="2340"/>
+            <w:tcW w:w="2340" w:type="dxa"/>
           </w:tcPr>
           <w:p>
             <w:r>
@@ -2678,7 +2736,7 @@
         </w:tc>
         <w:tc>
           <w:tcPr>
-            <w:tcW w:type="dxa" w:w="2340"/>
+            <w:tcW w:w="2340" w:type="dxa"/>
           </w:tcPr>
           <w:p>
             <w:r>
@@ -2688,7 +2746,7 @@
         </w:tc>
         <w:tc>
           <w:tcPr>
-            <w:tcW w:type="dxa" w:w="2340"/>
+            <w:tcW w:w="2340" w:type="dxa"/>
           </w:tcPr>
           <w:p>
             <w:r>
@@ -2700,7 +2758,7 @@
       <w:tr>
         <w:tc>
           <w:tcPr>
-            <w:tcW w:type="dxa" w:w="2340"/>
+            <w:tcW w:w="2340" w:type="dxa"/>
           </w:tcPr>
           <w:p>
             <w:r>
@@ -2710,7 +2768,7 @@
         </w:tc>
         <w:tc>
           <w:tcPr>
-            <w:tcW w:type="dxa" w:w="2340"/>
+            <w:tcW w:w="2340" w:type="dxa"/>
           </w:tcPr>
           <w:p>
             <w:r>
@@ -2720,7 +2778,7 @@
         </w:tc>
         <w:tc>
           <w:tcPr>
-            <w:tcW w:type="dxa" w:w="2340"/>
+            <w:tcW w:w="2340" w:type="dxa"/>
           </w:tcPr>
           <w:p>
             <w:r>
@@ -2730,7 +2788,7 @@
         </w:tc>
         <w:tc>
           <w:tcPr>
-            <w:tcW w:type="dxa" w:w="2340"/>
+            <w:tcW w:w="2340" w:type="dxa"/>
           </w:tcPr>
           <w:p>
             <w:r>
@@ -2742,7 +2800,7 @@
       <w:tr>
         <w:tc>
           <w:tcPr>
-            <w:tcW w:type="dxa" w:w="2340"/>
+            <w:tcW w:w="2340" w:type="dxa"/>
           </w:tcPr>
           <w:p>
             <w:r>
@@ -2752,7 +2810,7 @@
         </w:tc>
         <w:tc>
           <w:tcPr>
-            <w:tcW w:type="dxa" w:w="2340"/>
+            <w:tcW w:w="2340" w:type="dxa"/>
           </w:tcPr>
           <w:p>
             <w:r>
@@ -2762,7 +2820,7 @@
         </w:tc>
         <w:tc>
           <w:tcPr>
-            <w:tcW w:type="dxa" w:w="2340"/>
+            <w:tcW w:w="2340" w:type="dxa"/>
           </w:tcPr>
           <w:p>
             <w:r>
@@ -2772,7 +2830,7 @@
         </w:tc>
         <w:tc>
           <w:tcPr>
-            <w:tcW w:type="dxa" w:w="2340"/>
+            <w:tcW w:w="2340" w:type="dxa"/>
           </w:tcPr>
           <w:p>
             <w:r>
@@ -2784,7 +2842,7 @@
       <w:tr>
         <w:tc>
           <w:tcPr>
-            <w:tcW w:type="dxa" w:w="2340"/>
+            <w:tcW w:w="2340" w:type="dxa"/>
           </w:tcPr>
           <w:p>
             <w:r>
@@ -2794,7 +2852,7 @@
         </w:tc>
         <w:tc>
           <w:tcPr>
-            <w:tcW w:type="dxa" w:w="2340"/>
+            <w:tcW w:w="2340" w:type="dxa"/>
           </w:tcPr>
           <w:p>
             <w:r>
@@ -2804,7 +2862,7 @@
         </w:tc>
         <w:tc>
           <w:tcPr>
-            <w:tcW w:type="dxa" w:w="2340"/>
+            <w:tcW w:w="2340" w:type="dxa"/>
           </w:tcPr>
           <w:p>
             <w:r>
@@ -2814,7 +2872,7 @@
         </w:tc>
         <w:tc>
           <w:tcPr>
-            <w:tcW w:type="dxa" w:w="2340"/>
+            <w:tcW w:w="2340" w:type="dxa"/>
           </w:tcPr>
           <w:p>
             <w:r>
@@ -2826,7 +2884,7 @@
       <w:tr>
         <w:tc>
           <w:tcPr>
-            <w:tcW w:type="dxa" w:w="2340"/>
+            <w:tcW w:w="2340" w:type="dxa"/>
           </w:tcPr>
           <w:p>
             <w:r>
@@ -2836,7 +2894,7 @@
         </w:tc>
         <w:tc>
           <w:tcPr>
-            <w:tcW w:type="dxa" w:w="2340"/>
+            <w:tcW w:w="2340" w:type="dxa"/>
           </w:tcPr>
           <w:p>
             <w:r>
@@ -2846,7 +2904,7 @@
         </w:tc>
         <w:tc>
           <w:tcPr>
-            <w:tcW w:type="dxa" w:w="2340"/>
+            <w:tcW w:w="2340" w:type="dxa"/>
           </w:tcPr>
           <w:p>
             <w:r>
@@ -2856,7 +2914,7 @@
         </w:tc>
         <w:tc>
           <w:tcPr>
-            <w:tcW w:type="dxa" w:w="2340"/>
+            <w:tcW w:w="2340" w:type="dxa"/>
           </w:tcPr>
           <w:p>
             <w:r>
@@ -2868,7 +2926,7 @@
       <w:tr>
         <w:tc>
           <w:tcPr>
-            <w:tcW w:type="dxa" w:w="2340"/>
+            <w:tcW w:w="2340" w:type="dxa"/>
           </w:tcPr>
           <w:p>
             <w:r>
@@ -2878,7 +2936,7 @@
         </w:tc>
         <w:tc>
           <w:tcPr>
-            <w:tcW w:type="dxa" w:w="2340"/>
+            <w:tcW w:w="2340" w:type="dxa"/>
           </w:tcPr>
           <w:p>
             <w:r>
@@ -2888,7 +2946,7 @@
         </w:tc>
         <w:tc>
           <w:tcPr>
-            <w:tcW w:type="dxa" w:w="2340"/>
+            <w:tcW w:w="2340" w:type="dxa"/>
           </w:tcPr>
           <w:p>
             <w:r>
@@ -2898,7 +2956,7 @@
         </w:tc>
         <w:tc>
           <w:tcPr>
-            <w:tcW w:type="dxa" w:w="2340"/>
+            <w:tcW w:w="2340" w:type="dxa"/>
           </w:tcPr>
           <w:p>
             <w:r>
@@ -2910,7 +2968,7 @@
       <w:tr>
         <w:tc>
           <w:tcPr>
-            <w:tcW w:type="dxa" w:w="2340"/>
+            <w:tcW w:w="2340" w:type="dxa"/>
           </w:tcPr>
           <w:p>
             <w:r>
@@ -2920,7 +2978,7 @@
         </w:tc>
         <w:tc>
           <w:tcPr>
-            <w:tcW w:type="dxa" w:w="2340"/>
+            <w:tcW w:w="2340" w:type="dxa"/>
           </w:tcPr>
           <w:p>
             <w:r>
@@ -2930,7 +2988,7 @@
         </w:tc>
         <w:tc>
           <w:tcPr>
-            <w:tcW w:type="dxa" w:w="2340"/>
+            <w:tcW w:w="2340" w:type="dxa"/>
           </w:tcPr>
           <w:p>
             <w:r>
@@ -2940,7 +2998,7 @@
         </w:tc>
         <w:tc>
           <w:tcPr>
-            <w:tcW w:type="dxa" w:w="2340"/>
+            <w:tcW w:w="2340" w:type="dxa"/>
           </w:tcPr>
           <w:p>
             <w:r>
@@ -2952,7 +3010,7 @@
       <w:tr>
         <w:tc>
           <w:tcPr>
-            <w:tcW w:type="dxa" w:w="2340"/>
+            <w:tcW w:w="2340" w:type="dxa"/>
           </w:tcPr>
           <w:p>
             <w:r>
@@ -2962,7 +3020,7 @@
         </w:tc>
         <w:tc>
           <w:tcPr>
-            <w:tcW w:type="dxa" w:w="2340"/>
+            <w:tcW w:w="2340" w:type="dxa"/>
           </w:tcPr>
           <w:p>
             <w:r>
@@ -2972,7 +3030,7 @@
         </w:tc>
         <w:tc>
           <w:tcPr>
-            <w:tcW w:type="dxa" w:w="2340"/>
+            <w:tcW w:w="2340" w:type="dxa"/>
           </w:tcPr>
           <w:p>
             <w:r>
@@ -2982,7 +3040,7 @@
         </w:tc>
         <w:tc>
           <w:tcPr>
-            <w:tcW w:type="dxa" w:w="2340"/>
+            <w:tcW w:w="2340" w:type="dxa"/>
           </w:tcPr>
           <w:p>
             <w:r>
@@ -3003,7 +3061,6 @@
       </w:r>
     </w:p>
     <w:p>
-      <w:pPr/>
       <w:r>
         <w:t>Separate section; report routes use `SCHOOL_ATTENDANCE_REPORT` operations. Also considers `SCHOOL_CLASSES` and `SCHOOL_STUDENTS` for data scope.</w:t>
       </w:r>
@@ -3019,8 +3076,8 @@
     <w:tbl>
       <w:tblPr>
         <w:tblStyle w:val="TableGrid"/>
-        <w:tblW w:type="auto" w:w="0"/>
-        <w:tblLook w:firstColumn="1" w:firstRow="1" w:lastColumn="0" w:lastRow="0" w:noHBand="0" w:noVBand="1" w:val="04A0"/>
+        <w:tblW w:w="0" w:type="auto"/>
+        <w:tblLook w:val="04A0" w:firstRow="1" w:lastRow="0" w:firstColumn="1" w:lastColumn="0" w:noHBand="0" w:noVBand="1"/>
       </w:tblPr>
       <w:tblGrid>
         <w:gridCol w:w="3120"/>
@@ -3030,7 +3087,7 @@
       <w:tr>
         <w:tc>
           <w:tcPr>
-            <w:tcW w:type="dxa" w:w="3120"/>
+            <w:tcW w:w="3120" w:type="dxa"/>
           </w:tcPr>
           <w:p>
             <w:r>
@@ -3043,7 +3100,7 @@
         </w:tc>
         <w:tc>
           <w:tcPr>
-            <w:tcW w:type="dxa" w:w="3120"/>
+            <w:tcW w:w="3120" w:type="dxa"/>
           </w:tcPr>
           <w:p>
             <w:r>
@@ -3056,7 +3113,7 @@
         </w:tc>
         <w:tc>
           <w:tcPr>
-            <w:tcW w:type="dxa" w:w="3120"/>
+            <w:tcW w:w="3120" w:type="dxa"/>
           </w:tcPr>
           <w:p>
             <w:r>
@@ -3071,7 +3128,7 @@
       <w:tr>
         <w:tc>
           <w:tcPr>
-            <w:tcW w:type="dxa" w:w="3120"/>
+            <w:tcW w:w="3120" w:type="dxa"/>
           </w:tcPr>
           <w:p>
             <w:r>
@@ -3081,7 +3138,7 @@
         </w:tc>
         <w:tc>
           <w:tcPr>
-            <w:tcW w:type="dxa" w:w="3120"/>
+            <w:tcW w:w="3120" w:type="dxa"/>
           </w:tcPr>
           <w:p>
             <w:r>
@@ -3091,7 +3148,7 @@
         </w:tc>
         <w:tc>
           <w:tcPr>
-            <w:tcW w:type="dxa" w:w="3120"/>
+            <w:tcW w:w="3120" w:type="dxa"/>
           </w:tcPr>
           <w:p>
             <w:r>
@@ -3103,7 +3160,7 @@
       <w:tr>
         <w:tc>
           <w:tcPr>
-            <w:tcW w:type="dxa" w:w="3120"/>
+            <w:tcW w:w="3120" w:type="dxa"/>
           </w:tcPr>
           <w:p>
             <w:r>
@@ -3113,7 +3170,7 @@
         </w:tc>
         <w:tc>
           <w:tcPr>
-            <w:tcW w:type="dxa" w:w="3120"/>
+            <w:tcW w:w="3120" w:type="dxa"/>
           </w:tcPr>
           <w:p>
             <w:r>
@@ -3123,7 +3180,7 @@
         </w:tc>
         <w:tc>
           <w:tcPr>
-            <w:tcW w:type="dxa" w:w="3120"/>
+            <w:tcW w:w="3120" w:type="dxa"/>
           </w:tcPr>
           <w:p>
             <w:r>
@@ -3135,7 +3192,7 @@
       <w:tr>
         <w:tc>
           <w:tcPr>
-            <w:tcW w:type="dxa" w:w="3120"/>
+            <w:tcW w:w="3120" w:type="dxa"/>
           </w:tcPr>
           <w:p>
             <w:r>
@@ -3145,7 +3202,7 @@
         </w:tc>
         <w:tc>
           <w:tcPr>
-            <w:tcW w:type="dxa" w:w="3120"/>
+            <w:tcW w:w="3120" w:type="dxa"/>
           </w:tcPr>
           <w:p>
             <w:r>
@@ -3155,7 +3212,7 @@
         </w:tc>
         <w:tc>
           <w:tcPr>
-            <w:tcW w:type="dxa" w:w="3120"/>
+            <w:tcW w:w="3120" w:type="dxa"/>
           </w:tcPr>
           <w:p>
             <w:r>
@@ -3167,7 +3224,7 @@
       <w:tr>
         <w:tc>
           <w:tcPr>
-            <w:tcW w:type="dxa" w:w="3120"/>
+            <w:tcW w:w="3120" w:type="dxa"/>
           </w:tcPr>
           <w:p>
             <w:r>
@@ -3177,7 +3234,7 @@
         </w:tc>
         <w:tc>
           <w:tcPr>
-            <w:tcW w:type="dxa" w:w="3120"/>
+            <w:tcW w:w="3120" w:type="dxa"/>
           </w:tcPr>
           <w:p>
             <w:r>
@@ -3187,7 +3244,7 @@
         </w:tc>
         <w:tc>
           <w:tcPr>
-            <w:tcW w:type="dxa" w:w="3120"/>
+            <w:tcW w:w="3120" w:type="dxa"/>
           </w:tcPr>
           <w:p>
             <w:r>
@@ -3209,8 +3266,8 @@
     <w:tbl>
       <w:tblPr>
         <w:tblStyle w:val="TableGrid"/>
-        <w:tblW w:type="auto" w:w="0"/>
-        <w:tblLook w:firstColumn="1" w:firstRow="1" w:lastColumn="0" w:lastRow="0" w:noHBand="0" w:noVBand="1" w:val="04A0"/>
+        <w:tblW w:w="0" w:type="auto"/>
+        <w:tblLook w:val="04A0" w:firstRow="1" w:lastRow="0" w:firstColumn="1" w:lastColumn="0" w:noHBand="0" w:noVBand="1"/>
       </w:tblPr>
       <w:tblGrid>
         <w:gridCol w:w="3120"/>
@@ -3220,7 +3277,7 @@
       <w:tr>
         <w:tc>
           <w:tcPr>
-            <w:tcW w:type="dxa" w:w="3120"/>
+            <w:tcW w:w="3120" w:type="dxa"/>
           </w:tcPr>
           <w:p>
             <w:r>
@@ -3233,7 +3290,7 @@
         </w:tc>
         <w:tc>
           <w:tcPr>
-            <w:tcW w:type="dxa" w:w="3120"/>
+            <w:tcW w:w="3120" w:type="dxa"/>
           </w:tcPr>
           <w:p>
             <w:r>
@@ -3246,7 +3303,7 @@
         </w:tc>
         <w:tc>
           <w:tcPr>
-            <w:tcW w:type="dxa" w:w="3120"/>
+            <w:tcW w:w="3120" w:type="dxa"/>
           </w:tcPr>
           <w:p>
             <w:r>
@@ -3261,7 +3318,7 @@
       <w:tr>
         <w:tc>
           <w:tcPr>
-            <w:tcW w:type="dxa" w:w="3120"/>
+            <w:tcW w:w="3120" w:type="dxa"/>
           </w:tcPr>
           <w:p>
             <w:r>
@@ -3271,7 +3328,7 @@
         </w:tc>
         <w:tc>
           <w:tcPr>
-            <w:tcW w:type="dxa" w:w="3120"/>
+            <w:tcW w:w="3120" w:type="dxa"/>
           </w:tcPr>
           <w:p>
             <w:r>
@@ -3281,7 +3338,7 @@
         </w:tc>
         <w:tc>
           <w:tcPr>
-            <w:tcW w:type="dxa" w:w="3120"/>
+            <w:tcW w:w="3120" w:type="dxa"/>
           </w:tcPr>
           <w:p>
             <w:r>
@@ -3293,7 +3350,7 @@
       <w:tr>
         <w:tc>
           <w:tcPr>
-            <w:tcW w:type="dxa" w:w="3120"/>
+            <w:tcW w:w="3120" w:type="dxa"/>
           </w:tcPr>
           <w:p>
             <w:r>
@@ -3303,7 +3360,7 @@
         </w:tc>
         <w:tc>
           <w:tcPr>
-            <w:tcW w:type="dxa" w:w="3120"/>
+            <w:tcW w:w="3120" w:type="dxa"/>
           </w:tcPr>
           <w:p>
             <w:r>
@@ -3313,7 +3370,7 @@
         </w:tc>
         <w:tc>
           <w:tcPr>
-            <w:tcW w:type="dxa" w:w="3120"/>
+            <w:tcW w:w="3120" w:type="dxa"/>
           </w:tcPr>
           <w:p>
             <w:r>
@@ -3325,7 +3382,7 @@
       <w:tr>
         <w:tc>
           <w:tcPr>
-            <w:tcW w:type="dxa" w:w="3120"/>
+            <w:tcW w:w="3120" w:type="dxa"/>
           </w:tcPr>
           <w:p>
             <w:r>
@@ -3335,7 +3392,7 @@
         </w:tc>
         <w:tc>
           <w:tcPr>
-            <w:tcW w:type="dxa" w:w="3120"/>
+            <w:tcW w:w="3120" w:type="dxa"/>
           </w:tcPr>
           <w:p>
             <w:r>
@@ -3345,7 +3402,7 @@
         </w:tc>
         <w:tc>
           <w:tcPr>
-            <w:tcW w:type="dxa" w:w="3120"/>
+            <w:tcW w:w="3120" w:type="dxa"/>
           </w:tcPr>
           <w:p>
             <w:r>
@@ -3367,8 +3424,8 @@
     <w:tbl>
       <w:tblPr>
         <w:tblStyle w:val="TableGrid"/>
-        <w:tblW w:type="auto" w:w="0"/>
-        <w:tblLook w:firstColumn="1" w:firstRow="1" w:lastColumn="0" w:lastRow="0" w:noHBand="0" w:noVBand="1" w:val="04A0"/>
+        <w:tblW w:w="0" w:type="auto"/>
+        <w:tblLook w:val="04A0" w:firstRow="1" w:lastRow="0" w:firstColumn="1" w:lastColumn="0" w:noHBand="0" w:noVBand="1"/>
       </w:tblPr>
       <w:tblGrid>
         <w:gridCol w:w="3120"/>
@@ -3378,7 +3435,7 @@
       <w:tr>
         <w:tc>
           <w:tcPr>
-            <w:tcW w:type="dxa" w:w="3120"/>
+            <w:tcW w:w="3120" w:type="dxa"/>
           </w:tcPr>
           <w:p>
             <w:r>
@@ -3391,7 +3448,7 @@
         </w:tc>
         <w:tc>
           <w:tcPr>
-            <w:tcW w:type="dxa" w:w="3120"/>
+            <w:tcW w:w="3120" w:type="dxa"/>
           </w:tcPr>
           <w:p>
             <w:r>
@@ -3404,7 +3461,7 @@
         </w:tc>
         <w:tc>
           <w:tcPr>
-            <w:tcW w:type="dxa" w:w="3120"/>
+            <w:tcW w:w="3120" w:type="dxa"/>
           </w:tcPr>
           <w:p>
             <w:r>
@@ -3419,7 +3476,7 @@
       <w:tr>
         <w:tc>
           <w:tcPr>
-            <w:tcW w:type="dxa" w:w="3120"/>
+            <w:tcW w:w="3120" w:type="dxa"/>
           </w:tcPr>
           <w:p>
             <w:r>
@@ -3429,7 +3486,7 @@
         </w:tc>
         <w:tc>
           <w:tcPr>
-            <w:tcW w:type="dxa" w:w="3120"/>
+            <w:tcW w:w="3120" w:type="dxa"/>
           </w:tcPr>
           <w:p>
             <w:r>
@@ -3439,7 +3496,7 @@
         </w:tc>
         <w:tc>
           <w:tcPr>
-            <w:tcW w:type="dxa" w:w="3120"/>
+            <w:tcW w:w="3120" w:type="dxa"/>
           </w:tcPr>
           <w:p>
             <w:r>
@@ -3451,7 +3508,7 @@
       <w:tr>
         <w:tc>
           <w:tcPr>
-            <w:tcW w:type="dxa" w:w="3120"/>
+            <w:tcW w:w="3120" w:type="dxa"/>
           </w:tcPr>
           <w:p>
             <w:r>
@@ -3461,7 +3518,7 @@
         </w:tc>
         <w:tc>
           <w:tcPr>
-            <w:tcW w:type="dxa" w:w="3120"/>
+            <w:tcW w:w="3120" w:type="dxa"/>
           </w:tcPr>
           <w:p>
             <w:r>
@@ -3471,7 +3528,7 @@
         </w:tc>
         <w:tc>
           <w:tcPr>
-            <w:tcW w:type="dxa" w:w="3120"/>
+            <w:tcW w:w="3120" w:type="dxa"/>
           </w:tcPr>
           <w:p>
             <w:r>
@@ -3483,7 +3540,7 @@
       <w:tr>
         <w:tc>
           <w:tcPr>
-            <w:tcW w:type="dxa" w:w="3120"/>
+            <w:tcW w:w="3120" w:type="dxa"/>
           </w:tcPr>
           <w:p>
             <w:r>
@@ -3493,7 +3550,7 @@
         </w:tc>
         <w:tc>
           <w:tcPr>
-            <w:tcW w:type="dxa" w:w="3120"/>
+            <w:tcW w:w="3120" w:type="dxa"/>
           </w:tcPr>
           <w:p>
             <w:r>
@@ -3503,11 +3560,15 @@
         </w:tc>
         <w:tc>
           <w:tcPr>
-            <w:tcW w:type="dxa" w:w="3120"/>
-          </w:tcPr>
-          <w:p>
-            <w:r>
-              <w:t>No additional EXPORT extras beyond ORGANIZATION.</w:t>
+            <w:tcW w:w="3120" w:type="dxa"/>
+          </w:tcPr>
+          <w:p>
+            <w:r>
+              <w:t xml:space="preserve">No additional EXPORT extras </w:t>
+            </w:r>
+            <w:r>
+              <w:lastRenderedPageBreak/>
+              <w:t>beyond ORGANIZATION.</w:t>
             </w:r>
           </w:p>
         </w:tc>
@@ -3526,17 +3587,17 @@
     <w:tbl>
       <w:tblPr>
         <w:tblStyle w:val="TableGrid"/>
-        <w:tblW w:type="auto" w:w="0"/>
-        <w:tblLook w:firstColumn="1" w:firstRow="1" w:lastColumn="0" w:lastRow="0" w:noHBand="0" w:noVBand="1" w:val="04A0"/>
+        <w:tblW w:w="0" w:type="auto"/>
+        <w:tblLook w:val="04A0" w:firstRow="1" w:lastRow="0" w:firstColumn="1" w:lastColumn="0" w:noHBand="0" w:noVBand="1"/>
       </w:tblPr>
       <w:tblGrid>
-        <w:gridCol w:w="4680"/>
-        <w:gridCol w:w="4680"/>
+        <w:gridCol w:w="2658"/>
+        <w:gridCol w:w="6918"/>
       </w:tblGrid>
       <w:tr>
         <w:tc>
           <w:tcPr>
-            <w:tcW w:type="dxa" w:w="4680"/>
+            <w:tcW w:w="4680" w:type="dxa"/>
           </w:tcPr>
           <w:p>
             <w:r>
@@ -3549,7 +3610,7 @@
         </w:tc>
         <w:tc>
           <w:tcPr>
-            <w:tcW w:type="dxa" w:w="4680"/>
+            <w:tcW w:w="4680" w:type="dxa"/>
           </w:tcPr>
           <w:p>
             <w:r>
@@ -3564,7 +3625,7 @@
       <w:tr>
         <w:tc>
           <w:tcPr>
-            <w:tcW w:type="dxa" w:w="4680"/>
+            <w:tcW w:w="4680" w:type="dxa"/>
           </w:tcPr>
           <w:p>
             <w:r>
@@ -3574,7 +3635,7 @@
         </w:tc>
         <w:tc>
           <w:tcPr>
-            <w:tcW w:type="dxa" w:w="4680"/>
+            <w:tcW w:w="4680" w:type="dxa"/>
           </w:tcPr>
           <w:p>
             <w:r>
@@ -3586,7 +3647,7 @@
       <w:tr>
         <w:tc>
           <w:tcPr>
-            <w:tcW w:type="dxa" w:w="4680"/>
+            <w:tcW w:w="4680" w:type="dxa"/>
           </w:tcPr>
           <w:p>
             <w:r>
@@ -3596,7 +3657,7 @@
         </w:tc>
         <w:tc>
           <w:tcPr>
-            <w:tcW w:type="dxa" w:w="4680"/>
+            <w:tcW w:w="4680" w:type="dxa"/>
           </w:tcPr>
           <w:p>
             <w:r>
@@ -3608,7 +3669,7 @@
       <w:tr>
         <w:tc>
           <w:tcPr>
-            <w:tcW w:type="dxa" w:w="4680"/>
+            <w:tcW w:w="4680" w:type="dxa"/>
           </w:tcPr>
           <w:p>
             <w:r>
@@ -3618,7 +3679,7 @@
         </w:tc>
         <w:tc>
           <w:tcPr>
-            <w:tcW w:type="dxa" w:w="4680"/>
+            <w:tcW w:w="4680" w:type="dxa"/>
           </w:tcPr>
           <w:p>
             <w:r>
@@ -3630,7 +3691,7 @@
       <w:tr>
         <w:tc>
           <w:tcPr>
-            <w:tcW w:type="dxa" w:w="4680"/>
+            <w:tcW w:w="4680" w:type="dxa"/>
           </w:tcPr>
           <w:p>
             <w:r>
@@ -3640,7 +3701,7 @@
         </w:tc>
         <w:tc>
           <w:tcPr>
-            <w:tcW w:type="dxa" w:w="4680"/>
+            <w:tcW w:w="4680" w:type="dxa"/>
           </w:tcPr>
           <w:p>
             <w:r>
@@ -3652,7 +3713,7 @@
       <w:tr>
         <w:tc>
           <w:tcPr>
-            <w:tcW w:type="dxa" w:w="4680"/>
+            <w:tcW w:w="4680" w:type="dxa"/>
           </w:tcPr>
           <w:p>
             <w:r>
@@ -3662,7 +3723,7 @@
         </w:tc>
         <w:tc>
           <w:tcPr>
-            <w:tcW w:type="dxa" w:w="4680"/>
+            <w:tcW w:w="4680" w:type="dxa"/>
           </w:tcPr>
           <w:p>
             <w:r>
@@ -3674,7 +3735,7 @@
       <w:tr>
         <w:tc>
           <w:tcPr>
-            <w:tcW w:type="dxa" w:w="4680"/>
+            <w:tcW w:w="4680" w:type="dxa"/>
           </w:tcPr>
           <w:p>
             <w:r>
@@ -3684,7 +3745,7 @@
         </w:tc>
         <w:tc>
           <w:tcPr>
-            <w:tcW w:type="dxa" w:w="4680"/>
+            <w:tcW w:w="4680" w:type="dxa"/>
           </w:tcPr>
           <w:p>
             <w:r>
@@ -3705,13 +3766,11 @@
       </w:r>
     </w:p>
     <w:p>
-      <w:pPr/>
       <w:r>
         <w:t>Target changes to align runtime with this document:</w:t>
       </w:r>
     </w:p>
     <w:p>
-      <w:pPr/>
       <w:r>
         <w:t xml:space="preserve">1. Gate Attendance Matrix page and read APIs on </w:t>
       </w:r>

</xml_diff>